<commit_message>
Add STRIDE and SyFI funding awards
</commit_message>
<xml_diff>
--- a/baris-pt-curriculum-vitae_update.docx
+++ b/baris-pt-curriculum-vitae_update.docx
@@ -14822,6 +14822,12 @@
           <w:szCs w:val="22"/>
         </w:rPr>
         <w:t>Funded Research</w:t>
+      </w:r>
+    </w:p>
+    <w:p>
+      <w:pPr/>
+      <w:r>
+        <w:t>Cumulative funding: $11.501M attributable to my group ($86.324M total sponsored funding).</w:t>
       </w:r>
     </w:p>
     <w:tbl>
@@ -14953,6 +14959,210 @@
                 <w:szCs w:val="22"/>
               </w:rPr>
               <w:t>Dates</w:t>
+            </w:r>
+          </w:p>
+        </w:tc>
+      </w:tr>
+      <w:tr>
+        <w:tc>
+          <w:tcPr>
+            <w:tcW w:w="1384" w:type="dxa"/>
+          </w:tcPr>
+          <w:p>
+            <w:pPr>
+              <w:rPr>
+                <w:sz w:val="22"/>
+                <w:szCs w:val="22"/>
+              </w:rPr>
+            </w:pPr>
+            <w:r>
+              <w:rPr>
+                <w:sz w:val="22"/>
+                <w:szCs w:val="22"/>
+              </w:rPr>
+              <w:t>NSF / STRIDE Ventures</w:t>
+            </w:r>
+          </w:p>
+        </w:tc>
+        <w:tc>
+          <w:tcPr>
+            <w:tcW w:w="2481" w:type="dxa"/>
+          </w:tcPr>
+          <w:p>
+            <w:pPr>
+              <w:rPr>
+                <w:sz w:val="22"/>
+                <w:szCs w:val="22"/>
+              </w:rPr>
+            </w:pPr>
+            <w:r>
+              <w:rPr>
+                <w:sz w:val="22"/>
+                <w:szCs w:val="22"/>
+              </w:rPr>
+              <w:t>Infrastructure for AI / AI Efficiency Challenge</w:t>
+            </w:r>
+          </w:p>
+        </w:tc>
+        <w:tc>
+          <w:tcPr>
+            <w:tcW w:w="2250" w:type="dxa"/>
+          </w:tcPr>
+          <w:p>
+            <w:pPr>
+              <w:rPr>
+                <w:sz w:val="22"/>
+                <w:szCs w:val="22"/>
+              </w:rPr>
+            </w:pPr>
+            <w:r>
+              <w:rPr>
+                <w:sz w:val="22"/>
+                <w:szCs w:val="22"/>
+              </w:rPr>
+              <w:t>Co-PI (PI: Stephanie Wang; co-PIs: Arvind Krishnamurthy, Luke Zettlemoyer)</w:t>
+            </w:r>
+          </w:p>
+        </w:tc>
+        <w:tc>
+          <w:tcPr>
+            <w:tcW w:w="1710" w:type="dxa"/>
+          </w:tcPr>
+          <w:p>
+            <w:pPr>
+              <w:rPr>
+                <w:sz w:val="22"/>
+                <w:szCs w:val="22"/>
+              </w:rPr>
+            </w:pPr>
+            <w:r>
+              <w:rPr>
+                <w:sz w:val="22"/>
+                <w:szCs w:val="22"/>
+              </w:rPr>
+              <w:t>$3.5M/$875K</w:t>
+            </w:r>
+          </w:p>
+        </w:tc>
+        <w:tc>
+          <w:tcPr>
+            <w:tcW w:w="805" w:type="dxa"/>
+          </w:tcPr>
+          <w:p>
+            <w:pPr>
+              <w:rPr>
+                <w:sz w:val="22"/>
+                <w:szCs w:val="22"/>
+              </w:rPr>
+            </w:pPr>
+            <w:r>
+              <w:rPr>
+                <w:sz w:val="22"/>
+                <w:szCs w:val="22"/>
+              </w:rPr>
+              <w:t>2026 - 2028</w:t>
+            </w:r>
+          </w:p>
+        </w:tc>
+      </w:tr>
+      <w:tr>
+        <w:tc>
+          <w:tcPr>
+            <w:tcW w:w="1384" w:type="dxa"/>
+          </w:tcPr>
+          <w:p>
+            <w:pPr>
+              <w:rPr>
+                <w:sz w:val="22"/>
+                <w:szCs w:val="22"/>
+              </w:rPr>
+            </w:pPr>
+            <w:r>
+              <w:rPr>
+                <w:sz w:val="22"/>
+                <w:szCs w:val="22"/>
+              </w:rPr>
+              <w:t>AMD</w:t>
+            </w:r>
+          </w:p>
+        </w:tc>
+        <w:tc>
+          <w:tcPr>
+            <w:tcW w:w="2481" w:type="dxa"/>
+          </w:tcPr>
+          <w:p>
+            <w:pPr>
+              <w:rPr>
+                <w:sz w:val="22"/>
+                <w:szCs w:val="22"/>
+              </w:rPr>
+            </w:pPr>
+            <w:r>
+              <w:rPr>
+                <w:sz w:val="22"/>
+                <w:szCs w:val="22"/>
+              </w:rPr>
+              <w:t>Unrestricted Gift to SyFI</w:t>
+            </w:r>
+          </w:p>
+        </w:tc>
+        <w:tc>
+          <w:tcPr>
+            <w:tcW w:w="2250" w:type="dxa"/>
+          </w:tcPr>
+          <w:p>
+            <w:pPr>
+              <w:rPr>
+                <w:sz w:val="22"/>
+                <w:szCs w:val="22"/>
+              </w:rPr>
+            </w:pPr>
+            <w:r>
+              <w:rPr>
+                <w:sz w:val="22"/>
+                <w:szCs w:val="22"/>
+              </w:rPr>
+              <w:t>Co-PI (co-PI: Stephanie Wang)</w:t>
+            </w:r>
+          </w:p>
+        </w:tc>
+        <w:tc>
+          <w:tcPr>
+            <w:tcW w:w="1710" w:type="dxa"/>
+          </w:tcPr>
+          <w:p>
+            <w:pPr>
+              <w:rPr>
+                <w:sz w:val="22"/>
+                <w:szCs w:val="22"/>
+              </w:rPr>
+            </w:pPr>
+            <w:r>
+              <w:rPr>
+                <w:sz w:val="22"/>
+                <w:szCs w:val="22"/>
+              </w:rPr>
+              <w:t>$400K/$200K</w:t>
+            </w:r>
+          </w:p>
+        </w:tc>
+        <w:tc>
+          <w:tcPr>
+            <w:tcW w:w="805" w:type="dxa"/>
+          </w:tcPr>
+          <w:p>
+            <w:pPr>
+              <w:rPr>
+                <w:sz w:val="22"/>
+                <w:szCs w:val="22"/>
+              </w:rPr>
+            </w:pPr>
+            <w:r>
+              <w:rPr>
+                <w:sz w:val="22"/>
+                <w:szCs w:val="22"/>
+              </w:rPr>
+              <w:t>2026</w:t>
             </w:r>
           </w:p>
         </w:tc>

</xml_diff>